<commit_message>
Anteprojeto: número e turma na capa
Co-Authored-By: Claude Opus 5.5 <noreply@anthropic.com>
Claude-Session: https://claude.ai/code/session_012CiQQ2MjUjYDRmuen9pAmU
</commit_message>
<xml_diff>
--- a/docs/Anteprojeto_MultiMind.docx
+++ b/docs/Anteprojeto_MultiMind.docx
@@ -307,9 +307,8 @@
       <w:r>
         <w:rPr>
           <w:sz w:val="28"/>
-          <w:highlight w:val="yellow"/>
-        </w:rPr>
-        <w:t xml:space="preserve">Miguel Barbosa / nº ?? / 12.º ano / turma ??</w:t>
+        </w:rPr>
+        <w:t xml:space="preserve">Miguel Barbosa / nº 10 / 12.º ano / turma FI</w:t>
       </w:r>
     </w:p>
     <w:p>

</xml_diff>